<commit_message>
Adding files to github
</commit_message>
<xml_diff>
--- a/Week4_FINAL/ai_usage.docx
+++ b/Week4_FINAL/ai_usage.docx
@@ -333,302 +333,6 @@
         <w:t>Ask AI to create a simple beginner-friendly Python function that stores patient name, practitioner name and appointment time. Explicitly prohibit a database or GUI.</w:t>
       </w:r>
     </w:p>
-    <w:p>
-      <w:pPr>
-        <w:pStyle w:val="Heading1"/>
-      </w:pPr>
-      <w:r>
-        <w:t>Part E - Compare Human and AI Versions</w:t>
-      </w:r>
-    </w:p>
-    <w:tbl>
-      <w:tblPr>
-        <w:tblStyle w:val="TableGrid"/>
-        <w:tblW w:w="0" w:type="auto"/>
-        <w:tblLook w:val="04A0" w:firstRow="1" w:lastRow="0" w:firstColumn="1" w:lastColumn="0" w:noHBand="0" w:noVBand="1"/>
-      </w:tblPr>
-      <w:tblGrid>
-        <w:gridCol w:w="2998"/>
-        <w:gridCol w:w="3010"/>
-        <w:gridCol w:w="3008"/>
-      </w:tblGrid>
-      <w:tr>
-        <w:tc>
-          <w:tcPr>
-            <w:tcW w:w="3360" w:type="dxa"/>
-          </w:tcPr>
-          <w:p>
-            <w:r>
-              <w:t>Question</w:t>
-            </w:r>
-          </w:p>
-        </w:tc>
-        <w:tc>
-          <w:tcPr>
-            <w:tcW w:w="3360" w:type="dxa"/>
-          </w:tcPr>
-          <w:p>
-            <w:r>
-              <w:t>Human version</w:t>
-            </w:r>
-          </w:p>
-        </w:tc>
-        <w:tc>
-          <w:tcPr>
-            <w:tcW w:w="3360" w:type="dxa"/>
-          </w:tcPr>
-          <w:p>
-            <w:r>
-              <w:t>AI version</w:t>
-            </w:r>
-          </w:p>
-        </w:tc>
-      </w:tr>
-      <w:tr>
-        <w:tc>
-          <w:tcPr>
-            <w:tcW w:w="3360" w:type="dxa"/>
-          </w:tcPr>
-          <w:p>
-            <w:r>
-              <w:t>Easy to understand?</w:t>
-            </w:r>
-          </w:p>
-        </w:tc>
-        <w:tc>
-          <w:tcPr>
-            <w:tcW w:w="3360" w:type="dxa"/>
-          </w:tcPr>
-          <w:p>
-            <w:r>
-              <w:t>Yes. It uses basic Python concepts such as lists, dictionaries, functions, an if statement and a for loop.</w:t>
-            </w:r>
-          </w:p>
-        </w:tc>
-        <w:tc>
-          <w:tcPr>
-            <w:tcW w:w="3360" w:type="dxa"/>
-          </w:tcPr>
-          <w:p>
-            <w:r>
-              <w:t>Yes. The code is simple and uses a list, dictionary, function and for loop. The comments also make the steps easy to follow.</w:t>
-            </w:r>
-          </w:p>
-        </w:tc>
-      </w:tr>
-      <w:tr>
-        <w:tc>
-          <w:tcPr>
-            <w:tcW w:w="3360" w:type="dxa"/>
-          </w:tcPr>
-          <w:p>
-            <w:proofErr w:type="gramStart"/>
-            <w:r>
-              <w:t>Runs</w:t>
-            </w:r>
-            <w:proofErr w:type="gramEnd"/>
-            <w:r>
-              <w:t xml:space="preserve"> successfully?</w:t>
-            </w:r>
-          </w:p>
-        </w:tc>
-        <w:tc>
-          <w:tcPr>
-            <w:tcW w:w="3360" w:type="dxa"/>
-          </w:tcPr>
-          <w:p>
-            <w:r>
-              <w:t>Yes</w:t>
-            </w:r>
-            <w:r>
-              <w:t>.</w:t>
-            </w:r>
-          </w:p>
-        </w:tc>
-        <w:tc>
-          <w:tcPr>
-            <w:tcW w:w="3360" w:type="dxa"/>
-          </w:tcPr>
-          <w:p>
-            <w:r>
-              <w:t>Yes</w:t>
-            </w:r>
-            <w:r>
-              <w:t xml:space="preserve">. The program successfully stores and displays the two example appointments. </w:t>
-            </w:r>
-          </w:p>
-        </w:tc>
-      </w:tr>
-      <w:tr>
-        <w:tc>
-          <w:tcPr>
-            <w:tcW w:w="3360" w:type="dxa"/>
-          </w:tcPr>
-          <w:p>
-            <w:r>
-              <w:t>Uses only required features?</w:t>
-            </w:r>
-          </w:p>
-        </w:tc>
-        <w:tc>
-          <w:tcPr>
-            <w:tcW w:w="3360" w:type="dxa"/>
-          </w:tcPr>
-          <w:p>
-            <w:r>
-              <w:t>Yes</w:t>
-            </w:r>
-            <w:r>
-              <w:t>. It uses simple Python features and does not add a database, GUI or other unnecessary functionality.</w:t>
-            </w:r>
-          </w:p>
-        </w:tc>
-        <w:tc>
-          <w:tcPr>
-            <w:tcW w:w="3360" w:type="dxa"/>
-          </w:tcPr>
-          <w:p>
-            <w:r>
-              <w:t>Yes</w:t>
-            </w:r>
-            <w:r>
-              <w:t>. It only uses introductory Python features and does not add a database, GUI or advanced functionality.</w:t>
-            </w:r>
-          </w:p>
-        </w:tc>
-      </w:tr>
-      <w:tr>
-        <w:tc>
-          <w:tcPr>
-            <w:tcW w:w="3360" w:type="dxa"/>
-          </w:tcPr>
-          <w:p>
-            <w:r>
-              <w:t>Adds assumptions?</w:t>
-            </w:r>
-          </w:p>
-        </w:tc>
-        <w:tc>
-          <w:tcPr>
-            <w:tcW w:w="3360" w:type="dxa"/>
-          </w:tcPr>
-          <w:p>
-            <w:r>
-              <w:t>Very few. It assumes that appointment details can be stored as simple values and does not define additional rules for practitioner names or appointment times.</w:t>
-            </w:r>
-          </w:p>
-        </w:tc>
-        <w:tc>
-          <w:tcPr>
-            <w:tcW w:w="3360" w:type="dxa"/>
-          </w:tcPr>
-          <w:p>
-            <w:r>
-              <w:t>Very few. It assumes all values supplied to the function are valid and does not impose extra rules about names or appointment times.</w:t>
-            </w:r>
-          </w:p>
-        </w:tc>
-      </w:tr>
-      <w:tr>
-        <w:tc>
-          <w:tcPr>
-            <w:tcW w:w="3360" w:type="dxa"/>
-          </w:tcPr>
-          <w:p>
-            <w:r>
-              <w:t>Handles errors?</w:t>
-            </w:r>
-          </w:p>
-        </w:tc>
-        <w:tc>
-          <w:tcPr>
-            <w:tcW w:w="3360" w:type="dxa"/>
-          </w:tcPr>
-          <w:p>
-            <w:r>
-              <w:t xml:space="preserve">Partially. It rejects a missing/empty patient name, </w:t>
-            </w:r>
-            <w:r>
-              <w:lastRenderedPageBreak/>
-              <w:t xml:space="preserve">but it does not validate the </w:t>
-            </w:r>
-            <w:proofErr w:type="gramStart"/>
-            <w:r>
-              <w:t>practitioner</w:t>
-            </w:r>
-            <w:proofErr w:type="gramEnd"/>
-            <w:r>
-              <w:t xml:space="preserve"> name, appointment time or detect double bookings.</w:t>
-            </w:r>
-          </w:p>
-        </w:tc>
-        <w:tc>
-          <w:tcPr>
-            <w:tcW w:w="3360" w:type="dxa"/>
-          </w:tcPr>
-          <w:p>
-            <w:r>
-              <w:lastRenderedPageBreak/>
-              <w:t xml:space="preserve">No. It accepts </w:t>
-            </w:r>
-            <w:r>
-              <w:t xml:space="preserve">the information without checking whether the </w:t>
-            </w:r>
-            <w:proofErr w:type="gramStart"/>
-            <w:r>
-              <w:lastRenderedPageBreak/>
-              <w:t>patient</w:t>
-            </w:r>
-            <w:proofErr w:type="gramEnd"/>
-            <w:r>
-              <w:t xml:space="preserve"> name, </w:t>
-            </w:r>
-            <w:proofErr w:type="gramStart"/>
-            <w:r>
-              <w:t>practitioner</w:t>
-            </w:r>
-            <w:proofErr w:type="gramEnd"/>
-            <w:r>
-              <w:t xml:space="preserve"> name or appointment time is missing or invalid. It also does not detect double bookings.</w:t>
-            </w:r>
-          </w:p>
-        </w:tc>
-      </w:tr>
-      <w:tr>
-        <w:tc>
-          <w:tcPr>
-            <w:tcW w:w="3360" w:type="dxa"/>
-          </w:tcPr>
-          <w:p>
-            <w:r>
-              <w:lastRenderedPageBreak/>
-              <w:t>Could I explain it?</w:t>
-            </w:r>
-          </w:p>
-        </w:tc>
-        <w:tc>
-          <w:tcPr>
-            <w:tcW w:w="3360" w:type="dxa"/>
-          </w:tcPr>
-          <w:p>
-            <w:r>
-              <w:t>Yes. I can explain how the program creates, stores and displays appointments.</w:t>
-            </w:r>
-          </w:p>
-        </w:tc>
-        <w:tc>
-          <w:tcPr>
-            <w:tcW w:w="3360" w:type="dxa"/>
-          </w:tcPr>
-          <w:p>
-            <w:r>
-              <w:t>Yes. I can explain how the function creates a dictionary, adds it to the appointments list and how the for loop displays each appointment.</w:t>
-            </w:r>
-          </w:p>
-        </w:tc>
-      </w:tr>
-    </w:tbl>
-    <w:p/>
     <w:sectPr>
       <w:pgSz w:w="11906" w:h="16838"/>
       <w:pgMar w:top="1440" w:right="1440" w:bottom="1440" w:left="1440" w:header="708" w:footer="708" w:gutter="0"/>
@@ -1293,6 +997,7 @@
   <w:style w:type="character" w:default="1" w:styleId="DefaultParagraphFont">
     <w:name w:val="Default Paragraph Font"/>
     <w:uiPriority w:val="1"/>
+    <w:semiHidden/>
     <w:unhideWhenUsed/>
   </w:style>
   <w:style w:type="table" w:default="1" w:styleId="TableNormal">

</xml_diff>

<commit_message>
Editing the ai_usage document
</commit_message>
<xml_diff>
--- a/Week4_FINAL/ai_usage.docx
+++ b/Week4_FINAL/ai_usage.docx
@@ -333,6 +333,41 @@
         <w:t>Ask AI to create a simple beginner-friendly Python function that stores patient name, practitioner name and appointment time. Explicitly prohibit a database or GUI.</w:t>
       </w:r>
     </w:p>
+    <w:p/>
+    <w:p>
+      <w:r>
+        <w:t>The code generated for Part D can be found in the smartcare_v01 python file in Week4_FINAL. Below is a copy of the prompt used for generating the code in Microsoft copilot:</w:t>
+      </w:r>
+    </w:p>
+    <w:p/>
+    <w:p>
+      <w:pPr>
+        <w:rPr>
+          <w:lang w:val="en-AU"/>
+        </w:rPr>
+      </w:pPr>
+      <w:r>
+        <w:rPr>
+          <w:lang w:val="en-AU"/>
+        </w:rPr>
+        <w:t xml:space="preserve">Create a simple, beginner friendly Python function that stores: </w:t>
+      </w:r>
+      <w:r>
+        <w:rPr>
+          <w:lang w:val="en-AU"/>
+        </w:rPr>
+        <w:br/>
+        <w:t xml:space="preserve">- patient name - practitioner name - appointment time </w:t>
+      </w:r>
+      <w:r>
+        <w:rPr>
+          <w:lang w:val="en-AU"/>
+        </w:rPr>
+        <w:br/>
+        <w:t>Use only introductory concepts. Do not use a database. Do not use a GUI. Keep the code simple enough for a beginner Python student to understand.</w:t>
+      </w:r>
+    </w:p>
+    <w:p/>
     <w:sectPr>
       <w:pgSz w:w="11906" w:h="16838"/>
       <w:pgMar w:top="1440" w:right="1440" w:bottom="1440" w:left="1440" w:header="708" w:footer="708" w:gutter="0"/>
@@ -997,7 +1032,6 @@
   <w:style w:type="character" w:default="1" w:styleId="DefaultParagraphFont">
     <w:name w:val="Default Paragraph Font"/>
     <w:uiPriority w:val="1"/>
-    <w:semiHidden/>
     <w:unhideWhenUsed/>
   </w:style>
   <w:style w:type="table" w:default="1" w:styleId="TableNormal">

</xml_diff>